<commit_message>
Refresh handoff documentation and line references
</commit_message>
<xml_diff>
--- a/AZ04-Equipment-Checkout-System-Owner-Guide.docx
+++ b/AZ04-Equipment-Checkout-System-Owner-Guide.docx
@@ -77,12 +77,7 @@
         <w:spacing w:after="180"/>
       </w:pPr>
       <w:r>
-        <w:rPr>
-          <w:rFonts w:ascii="Helvetica" w:hAnsi="Helvetica" w:cs="Helvetica"/>
-          <w:sz w:val="22"/>
-          <w:sz-cs w:val="22"/>
-        </w:rPr>
-        <w:t xml:space="preserve">Date: April 20, 2026</w:t>
+        <w:t>Date: June 4, 2026</w:t>
       </w:r>
     </w:p>
     <w:p>

</xml_diff>